<commit_message>
add .lnk file to combined results, update Main to find image parameters
</commit_message>
<xml_diff>
--- a/Paper/Brief Methods - Liver Disease.docx
+++ b/Paper/Brief Methods - Liver Disease.docx
@@ -3,8 +3,371 @@
 <w:document xmlns:wpc="http://schemas.microsoft.com/office/word/2010/wordprocessingCanvas" xmlns:cx="http://schemas.microsoft.com/office/drawing/2014/chartex" xmlns:cx1="http://schemas.microsoft.com/office/drawing/2015/9/8/chartex" xmlns:mc="http://schemas.openxmlformats.org/markup-compatibility/2006" xmlns:o="urn:schemas-microsoft-com:office:office" xmlns:r="http://schemas.openxmlformats.org/officeDocument/2006/relationships" xmlns:m="http://schemas.openxmlformats.org/officeDocument/2006/math" xmlns:v="urn:schemas-microsoft-com:vml" xmlns:wp14="http://schemas.microsoft.com/office/word/2010/wordprocessingDrawing" xmlns:wp="http://schemas.openxmlformats.org/drawingml/2006/wordprocessingDrawing" xmlns:w10="urn:schemas-microsoft-com:office:word" xmlns:w="http://schemas.openxmlformats.org/wordprocessingml/2006/main" xmlns:w14="http://schemas.microsoft.com/office/word/2010/wordml" xmlns:w15="http://schemas.microsoft.com/office/word/2012/wordml" xmlns:w16se="http://schemas.microsoft.com/office/word/2015/wordml/symex" xmlns:wpg="http://schemas.microsoft.com/office/word/2010/wordprocessingGroup" xmlns:wpi="http://schemas.microsoft.com/office/word/2010/wordprocessingInk" xmlns:wne="http://schemas.microsoft.com/office/word/2006/wordml" xmlns:wps="http://schemas.microsoft.com/office/word/2010/wordprocessingShape" mc:Ignorable="w14 w15 w16se wp14">
   <w:body>
     <w:p>
-      <w:r>
-        <w:t>Liver disease/ablation segmentation is a particularly important for our task as it presents a potential bottleneck to our predictive process. For data, we retrieved 104 patients from the publically available Liver Tumor Segmentation (</w:t>
+      <w:pPr>
+        <w:pStyle w:val="Heading1"/>
+      </w:pPr>
+      <w:r>
+        <w:t>Introduction</w:t>
+      </w:r>
+    </w:p>
+    <w:p>
+      <w:pPr>
+        <w:pStyle w:val="Heading2"/>
+      </w:pPr>
+      <w:r>
+        <w:t>Colorectal Cancer in the United States</w:t>
+      </w:r>
+    </w:p>
+    <w:p>
+      <w:r>
+        <w:t xml:space="preserve">Colorectal cancer (CRC) is one of the predominant forms of cancer within the United States, </w:t>
+      </w:r>
+      <w:r>
+        <w:t>being the 3</w:t>
+      </w:r>
+      <w:r>
+        <w:rPr>
+          <w:vertAlign w:val="superscript"/>
+        </w:rPr>
+        <w:t>rd</w:t>
+      </w:r>
+      <w:r>
+        <w:t xml:space="preserve"> most common cause of cancer and cancer death in both men and women</w:t>
+      </w:r>
+      <w:r>
+        <w:fldChar w:fldCharType="begin" w:fldLock="1"/>
+      </w:r>
+      <w:r>
+        <w:instrText>ADDIN CSL_CITATION {"citationItems":[{"id":"ITEM-1","itemData":{"DOI":"10.3322/caac.21551","ISSN":"0007-9235","PMID":"30620402","abstract":"Each year, the American Cancer Society estimates the numbers of new cancer cases and deaths that will occur in the United States and compiles the most recent data on cancer incidence, mortality, and survival. Incidence data, available through 2015, were collected by the Surveillance, Epidemiology, and End Results Program; the National Program of Cancer Registries; and the North American Association of Central Cancer Registries. Mortality data, available through 2016, were collected by the National Center for Health Statistics. In 2019, 1,762,450 new cancer cases and 606,880 cancer deaths are projected to occur in the United States. Over the past decade of data, the cancer incidence rate (2006-2015) was stable in women and declined by approximately 2% per year in men, whereas the cancer death rate (2007-2016) declined annually by 1.4% and 1.8%, respectively. The overall cancer death rate dropped continuously from 1991 to 2016 by a total of 27%, translating into approximately 2,629,200 fewer cancer deaths than would have been expected if death rates had remained at their peak. Although the racial gap in cancer mortality is slowly narrowing, socioeconomic inequalities are widening, with the most notable gaps for the most preventable cancers. For example, compared with the most affluent counties, mortality rates in the poorest counties were 2-fold higher for cervical cancer and 40% higher for male lung and liver cancers during 2012-2016. Some states are home to both the wealthiest and the poorest counties, suggesting the opportunity for more equitable dissemination of effective cancer prevention, early detection, and treatment strategies. A broader application of existing cancer control knowledge with an emphasis on disadvantaged groups would undoubtedly accelerate progress against cancer.","author":[{"dropping-particle":"","family":"Siegel","given":"Rebecca L.","non-dropping-particle":"","parse-names":false,"suffix":""},{"dropping-particle":"","family":"Miller","given":"Kimberly D.","non-dropping-particle":"","parse-names":false,"suffix":""},{"dropping-particle":"","family":"Jemal","given":"Ahmedin","non-dropping-particle":"","parse-names":false,"suffix":""}],"container-title":"CA: A Cancer Journal for Clinicians","id":"ITEM-1","issue":"1","issued":{"date-parts":[["2019","1","1"]]},"page":"7-34","publisher":"Wiley","title":"Cancer statistics, 2019","type":"article-journal","volume":"69"},"uris":["http://www.mendeley.com/documents/?uuid=0654017f-377a-34b7-9bb4-a6832b71acfd"]}],"mendeley":{"formattedCitation":"(Siegel et al., 2019)","plainTextFormattedCitation":"(Siegel et al., 2019)","previouslyFormattedCitation":"(Siegel et al., 2019)"},"properties":{"noteIndex":0},"schema":"https://github.com/citation-style-language/schema/raw/master/csl-citation.json"}</w:instrText>
+      </w:r>
+      <w:r>
+        <w:fldChar w:fldCharType="separate"/>
+      </w:r>
+      <w:r>
+        <w:rPr>
+          <w:noProof/>
+        </w:rPr>
+        <w:t>(Siegel et al., 2019)</w:t>
+      </w:r>
+      <w:r>
+        <w:fldChar w:fldCharType="end"/>
+      </w:r>
+      <w:r>
+        <w:t xml:space="preserve">.  </w:t>
+      </w:r>
+      <w:r>
+        <w:t>While 25% of patients present colorectal liver metastasis (CRL-</w:t>
+      </w:r>
+      <w:proofErr w:type="spellStart"/>
+      <w:r>
+        <w:t>mets</w:t>
+      </w:r>
+      <w:proofErr w:type="spellEnd"/>
+      <w:r>
+        <w:t>) at the time of diagnosis</w:t>
+      </w:r>
+      <w:r>
+        <w:t>,</w:t>
+      </w:r>
+      <w:r>
+        <w:t xml:space="preserve"> up to 6</w:t>
+      </w:r>
+      <w:r>
+        <w:t xml:space="preserve">0% will develop </w:t>
+      </w:r>
+      <w:r>
+        <w:t>CRL-</w:t>
+      </w:r>
+      <w:proofErr w:type="spellStart"/>
+      <w:r>
+        <w:t>mets</w:t>
+      </w:r>
+      <w:proofErr w:type="spellEnd"/>
+      <w:r>
+        <w:t xml:space="preserve"> over the course of their disease</w:t>
+      </w:r>
+      <w:r>
+        <w:fldChar w:fldCharType="begin" w:fldLock="1"/>
+      </w:r>
+      <w:r>
+        <w:instrText>ADDIN CSL_CITATION {"citationItems":[{"id":"ITEM-1","itemData":{"DOI":"10.3748/wjg.v22.i11.3127","ISSN":"22192840","abstract":"Colorectal cancer metastasizes predictably, with liver predominance in most cases. Because liver involvement has been shown to be a major determinant of survival in this population, liver-directed therapies are increasingly considered even in cases where there is (limited) extrahepatic disease. Unfortunately, these patients carry a known risk of recurrence in the liver regardless of initial therapy choice. Therefore, there is a demand for minimally invasive, non-surgical, personalized cancer treatments to preserve quality of life in the induction, consolidation, and maintenance phases of cancer therapy. This report aims to review evidence - based conceptual, pharmacological, and technological paradigm shifts in parenteral and percutaneous treatment strategies as well as forthcoming evidence regarding next-generation systemic, locoregional, and local treatment approaches for this patient population.","author":[{"dropping-particle":"","family":"Alper Sag","given":"Alan","non-dropping-particle":"","parse-names":false,"suffix":""},{"dropping-particle":"","family":"Selcukbiricik","given":"Fatih","non-dropping-particle":"","parse-names":false,"suffix":""},{"dropping-particle":"","family":"Mandel","given":"Nil Molinas","non-dropping-particle":"","parse-names":false,"suffix":""}],"container-title":"World Journal of Gastroenterology","id":"ITEM-1","issue":"11","issued":{"date-parts":[["2016","3","21"]]},"page":"3127-3149","publisher":"Baishideng Publishing Group Co., Limited","title":"Evidence-based medical oncology and interventional radiology paradigms for liver-dominant colorectal cancer metastases","type":"article","volume":"22"},"uris":["http://www.mendeley.com/documents/?uuid=1bc39a07-7abd-3469-b394-8e1183f89fb6"]}],"mendeley":{"formattedCitation":"(Alper Sag et al., 2016)","plainTextFormattedCitation":"(Alper Sag et al., 2016)"},"properties":{"noteIndex":0},"schema":"https://github.com/citation-style-language/schema/raw/master/csl-citation.json"}</w:instrText>
+      </w:r>
+      <w:r>
+        <w:fldChar w:fldCharType="separate"/>
+      </w:r>
+      <w:r>
+        <w:rPr>
+          <w:noProof/>
+        </w:rPr>
+        <w:t>(</w:t>
+      </w:r>
+      <w:proofErr w:type="spellStart"/>
+      <w:r>
+        <w:rPr>
+          <w:noProof/>
+        </w:rPr>
+        <w:t>Alper</w:t>
+      </w:r>
+      <w:proofErr w:type="spellEnd"/>
+      <w:r>
+        <w:rPr>
+          <w:noProof/>
+        </w:rPr>
+        <w:t xml:space="preserve"> Sag et al., 2016)</w:t>
+      </w:r>
+      <w:r>
+        <w:fldChar w:fldCharType="end"/>
+      </w:r>
+      <w:r>
+        <w:t>.</w:t>
+      </w:r>
+    </w:p>
+    <w:p>
+      <w:pPr>
+        <w:pStyle w:val="Heading2"/>
+      </w:pPr>
+      <w:r>
+        <w:t>Detection of Colorectal Liver Metastasis (CRL-</w:t>
+      </w:r>
+      <w:proofErr w:type="spellStart"/>
+      <w:r>
+        <w:t>mets</w:t>
+      </w:r>
+      <w:proofErr w:type="spellEnd"/>
+      <w:r>
+        <w:t>)</w:t>
+      </w:r>
+    </w:p>
+    <w:p>
+      <w:r>
+        <w:t>While s</w:t>
+      </w:r>
+      <w:r>
+        <w:t>everal treatment options</w:t>
+      </w:r>
+      <w:r>
+        <w:t xml:space="preserve"> are available</w:t>
+      </w:r>
+      <w:r>
+        <w:t xml:space="preserve"> for </w:t>
+      </w:r>
+      <w:r>
+        <w:t>CRL</w:t>
+      </w:r>
+      <w:r>
+        <w:t>-</w:t>
+      </w:r>
+      <w:proofErr w:type="spellStart"/>
+      <w:r>
+        <w:t>mets</w:t>
+      </w:r>
+      <w:proofErr w:type="spellEnd"/>
+      <w:r>
+        <w:t xml:space="preserve">, they all first </w:t>
+      </w:r>
+      <w:r>
+        <w:t xml:space="preserve">rely </w:t>
+      </w:r>
+      <w:r>
+        <w:t xml:space="preserve">on the proper identification of the </w:t>
+      </w:r>
+      <w:r>
+        <w:t>disease</w:t>
+      </w:r>
+      <w:r>
+        <w:t xml:space="preserve">. Several </w:t>
+      </w:r>
+      <w:r>
+        <w:t>imaging techniques</w:t>
+      </w:r>
+      <w:r>
+        <w:t xml:space="preserve"> exist to identify CRL-</w:t>
+      </w:r>
+      <w:proofErr w:type="spellStart"/>
+      <w:r>
+        <w:t>mets</w:t>
+      </w:r>
+      <w:proofErr w:type="spellEnd"/>
+      <w:r>
+        <w:t xml:space="preserve">: </w:t>
+      </w:r>
+      <w:r>
+        <w:t>ultrasound [</w:t>
+      </w:r>
+      <w:r>
+        <w:t xml:space="preserve">ref], Computed </w:t>
+      </w:r>
+      <w:r>
+        <w:t>Tomography</w:t>
+      </w:r>
+      <w:r>
+        <w:t xml:space="preserve"> (CT)</w:t>
+      </w:r>
+      <w:r>
+        <w:t xml:space="preserve"> </w:t>
+      </w:r>
+      <w:r>
+        <w:t xml:space="preserve">[ref], </w:t>
+      </w:r>
+      <w:r>
+        <w:t xml:space="preserve">Positron Emission Tomography (PET), </w:t>
+      </w:r>
+      <w:r>
+        <w:t xml:space="preserve">and/or </w:t>
+      </w:r>
+      <w:r>
+        <w:t>nuclear Magnetic Resonance Imaging (</w:t>
+      </w:r>
+      <w:proofErr w:type="spellStart"/>
+      <w:r>
+        <w:t>nMRI</w:t>
+      </w:r>
+      <w:proofErr w:type="spellEnd"/>
+      <w:r>
+        <w:t>)</w:t>
+      </w:r>
+      <w:r>
+        <w:t xml:space="preserve"> </w:t>
+      </w:r>
+      <w:r>
+        <w:t>[ref]</w:t>
+      </w:r>
+      <w:r>
+        <w:t>;</w:t>
+      </w:r>
+      <w:r>
+        <w:t xml:space="preserve"> however,</w:t>
+      </w:r>
+      <w:r>
+        <w:t xml:space="preserve"> the </w:t>
+      </w:r>
+      <w:r>
+        <w:t xml:space="preserve">gold </w:t>
+      </w:r>
+      <w:r>
+        <w:t xml:space="preserve">standard </w:t>
+      </w:r>
+      <w:r>
+        <w:t>consists of a contrast-</w:t>
+      </w:r>
+      <w:r>
+        <w:t>enhanced CT</w:t>
+      </w:r>
+      <w:r>
+        <w:t xml:space="preserve"> (CECT)</w:t>
+      </w:r>
+      <w:r>
+        <w:t xml:space="preserve"> scan[ref].</w:t>
+      </w:r>
+      <w:r>
+        <w:t xml:space="preserve"> </w:t>
+      </w:r>
+      <w:r>
+        <w:t xml:space="preserve">A CECT often consists of three phases: an arterial phase where the contrast is most prominent in the artery, the portal-venous phase, where contrast is mostly present within the </w:t>
+      </w:r>
+      <w:proofErr w:type="gramStart"/>
+      <w:r>
+        <w:t>portal-vein</w:t>
+      </w:r>
+      <w:proofErr w:type="gramEnd"/>
+      <w:r>
+        <w:t xml:space="preserve">, and a washout phase. </w:t>
+      </w:r>
+      <w:r>
+        <w:t>CRL-</w:t>
+      </w:r>
+      <w:proofErr w:type="spellStart"/>
+      <w:r>
+        <w:t>mets</w:t>
+      </w:r>
+      <w:proofErr w:type="spellEnd"/>
+      <w:r>
+        <w:t xml:space="preserve"> often appear as hypo-dense regions in the arterial and portal-venous p</w:t>
+      </w:r>
+      <w:r>
+        <w:t>hase of the image, in stark contrast to the normal liver tissue.</w:t>
+      </w:r>
+    </w:p>
+    <w:p>
+      <w:r>
+        <w:t>Challenges with detecting CRL-</w:t>
+      </w:r>
+      <w:proofErr w:type="spellStart"/>
+      <w:r>
+        <w:t>mets</w:t>
+      </w:r>
+      <w:proofErr w:type="spellEnd"/>
+      <w:r>
+        <w:t xml:space="preserve"> are mostly with respect to the diseases relatively small size and large search area in the liver. </w:t>
+      </w:r>
+      <w:r>
+        <w:t>Furthermore, interventions such as radiation therapy, radiofrequency ablation, and microwave ablation, require accurate segmentations of the disease site. To date, automated liver disease segmentation tasks have largely focused on primary liver disease, although new competitions such as the Liver Tumor segmentation (</w:t>
+      </w:r>
+      <w:proofErr w:type="spellStart"/>
+      <w:r>
+        <w:t>LiTs</w:t>
+      </w:r>
+      <w:proofErr w:type="spellEnd"/>
+      <w:r>
+        <w:t>) challenge have contained data of both primary and secondary liver cancers.</w:t>
+      </w:r>
+    </w:p>
+    <w:p>
+      <w:pPr>
+        <w:pStyle w:val="Heading2"/>
+      </w:pPr>
+      <w:r>
+        <w:t>Ablation Therapies</w:t>
+      </w:r>
+    </w:p>
+    <w:p>
+      <w:r>
+        <w:t>Specifically for ablation interventions, segmentations of the disease in the pre-treatment imaging, and the generated ablation cavity in the post-treatment imaging, are important for evaluating the minimum delivered ablation margin. Both radiofrequency and microwave ablation interventions require that a minimum margin be delivered around the gross disease to ensure that all microscopic disease is treated. While automated workflows exist to map the disease from the pre-treatment to the post-treatment imaging to assess treatment efficacy, these still require manual segmentations of both disease and ablation zone.</w:t>
+      </w:r>
+    </w:p>
+    <w:p>
+      <w:r>
+        <w:t xml:space="preserve">We hypothesize </w:t>
+      </w:r>
+      <w:r>
+        <w:t>that fully convolutional neural networks, trained in a unique fashion to account for the challenges of disease size with respect to the overall liver, can provide rapid and accurate segmentations of both CRL-</w:t>
+      </w:r>
+      <w:proofErr w:type="spellStart"/>
+      <w:r>
+        <w:t>mets</w:t>
+      </w:r>
+      <w:proofErr w:type="spellEnd"/>
+      <w:r>
+        <w:t xml:space="preserve"> and ablation generated cavities. The creation of which would enable dose escalation studies of CRL-</w:t>
+      </w:r>
+      <w:proofErr w:type="spellStart"/>
+      <w:r>
+        <w:t>mets</w:t>
+      </w:r>
+      <w:proofErr w:type="spellEnd"/>
+      <w:r>
+        <w:t xml:space="preserve"> in radiation therapy, and facilitate margin evaluations in ablation therapy.</w:t>
+      </w:r>
+    </w:p>
+    <w:p>
+      <w:pPr>
+        <w:pStyle w:val="Heading1"/>
+      </w:pPr>
+      <w:r>
+        <w:t>Materials/Methods</w:t>
+      </w:r>
+    </w:p>
+    <w:p>
+      <w:pPr>
+        <w:pStyle w:val="Heading2"/>
+      </w:pPr>
+      <w:r>
+        <w:t>Data</w:t>
+      </w:r>
+    </w:p>
+    <w:p>
+      <w:r>
+        <w:t xml:space="preserve">To ensure that our model is reproducible at other institutions, our training\optimization data was collected from the publically available Liver Tumor Segmentation, </w:t>
       </w:r>
       <w:proofErr w:type="spellStart"/>
       <w:r>
@@ -12,26 +375,55 @@
       </w:r>
       <w:proofErr w:type="spellEnd"/>
       <w:r>
-        <w:t xml:space="preserve">) challenge, which were then distributed into 61 training, 12 validation, and 31 test groups. Leveraging our previous success with liver segmentation, we begin the task of disease segmentation by searching within the bounding box of the liver. Our architecture consists of multiple </w:t>
-      </w:r>
-      <w:proofErr w:type="spellStart"/>
-      <w:r>
-        <w:t>atrous</w:t>
-      </w:r>
-      <w:proofErr w:type="spellEnd"/>
-      <w:r>
-        <w:t xml:space="preserve"> convolutions combined with residual connections. The </w:t>
-      </w:r>
-      <w:proofErr w:type="spellStart"/>
-      <w:r>
-        <w:t>atrous</w:t>
-      </w:r>
-      <w:proofErr w:type="spellEnd"/>
-      <w:r>
-        <w:t xml:space="preserve"> convolutions maintain image resolution while gradually increasing receptive field size, and residual connections ensure that previous activations are propagated through the network. The model was trained by randomly pulling cubes of disease from patients in the training set. Hyper parameters for the model include training with a cyclical learning rate, varying cube size, and optimizer to be either Stochastic Gradient Descent or Adam.</w:t>
+        <w:t>, challenge (</w:t>
+      </w:r>
+      <w:hyperlink r:id="rId5" w:history="1">
+        <w:r>
+          <w:rPr>
+            <w:rStyle w:val="Hyperlink"/>
+          </w:rPr>
+          <w:t>https://competitions.codalab.org/competitions/17094</w:t>
+        </w:r>
+      </w:hyperlink>
+      <w:r>
+        <w:t xml:space="preserve">). This data consisted of </w:t>
       </w:r>
       <w:bookmarkStart w:id="0" w:name="_GoBack"/>
       <w:bookmarkEnd w:id="0"/>
+      <w:r>
+        <w:t xml:space="preserve">.   included ground truth liver and disease segmentations from our </w:t>
+      </w:r>
+      <w:r>
+        <w:t xml:space="preserve">For data, we retrieved 104 patients from the publically </w:t>
+      </w:r>
+      <w:r>
+        <w:lastRenderedPageBreak/>
+        <w:t>available Liver Tumor Segmentation (</w:t>
+      </w:r>
+      <w:proofErr w:type="spellStart"/>
+      <w:r>
+        <w:t>LiTS</w:t>
+      </w:r>
+      <w:proofErr w:type="spellEnd"/>
+      <w:r>
+        <w:t xml:space="preserve">) challenge, which were then distributed into 61 training, 12 validation, and 31 test groups. Leveraging our previous success with liver segmentation, we begin the task of disease segmentation by searching within the bounding box of the liver. Our architecture consists of multiple </w:t>
+      </w:r>
+      <w:proofErr w:type="spellStart"/>
+      <w:r>
+        <w:t>atrous</w:t>
+      </w:r>
+      <w:proofErr w:type="spellEnd"/>
+      <w:r>
+        <w:t xml:space="preserve"> convolutions combined with residual connections. The </w:t>
+      </w:r>
+      <w:proofErr w:type="spellStart"/>
+      <w:r>
+        <w:t>atrous</w:t>
+      </w:r>
+      <w:proofErr w:type="spellEnd"/>
+      <w:r>
+        <w:t xml:space="preserve"> convolutions maintain image resolution while gradually increasing receptive field size, and residual connections ensure that previous activations are propagated through the network. The model was trained by randomly pulling cubes of disease from patients in the training set. Hyper parameters for the model include training with a cyclical learning rate, varying cube size, and optimizer to be either Stochastic Gradient Descent or Adam.</w:t>
+      </w:r>
     </w:p>
     <w:sectPr>
       <w:pgSz w:w="12240" w:h="15840"/>
@@ -437,6 +829,49 @@
     <w:name w:val="Normal"/>
     <w:qFormat/>
   </w:style>
+  <w:style w:type="paragraph" w:styleId="Heading1">
+    <w:name w:val="heading 1"/>
+    <w:basedOn w:val="Normal"/>
+    <w:next w:val="Normal"/>
+    <w:link w:val="Heading1Char"/>
+    <w:uiPriority w:val="9"/>
+    <w:qFormat/>
+    <w:rsid w:val="00201B5D"/>
+    <w:pPr>
+      <w:keepNext/>
+      <w:keepLines/>
+      <w:spacing w:before="240" w:after="0"/>
+      <w:outlineLvl w:val="0"/>
+    </w:pPr>
+    <w:rPr>
+      <w:rFonts w:asciiTheme="majorHAnsi" w:eastAsiaTheme="majorEastAsia" w:hAnsiTheme="majorHAnsi" w:cstheme="majorBidi"/>
+      <w:color w:val="2E74B5" w:themeColor="accent1" w:themeShade="BF"/>
+      <w:sz w:val="32"/>
+      <w:szCs w:val="32"/>
+    </w:rPr>
+  </w:style>
+  <w:style w:type="paragraph" w:styleId="Heading2">
+    <w:name w:val="heading 2"/>
+    <w:basedOn w:val="Normal"/>
+    <w:next w:val="Normal"/>
+    <w:link w:val="Heading2Char"/>
+    <w:uiPriority w:val="9"/>
+    <w:unhideWhenUsed/>
+    <w:qFormat/>
+    <w:rsid w:val="00201B5D"/>
+    <w:pPr>
+      <w:keepNext/>
+      <w:keepLines/>
+      <w:spacing w:before="40" w:after="0"/>
+      <w:outlineLvl w:val="1"/>
+    </w:pPr>
+    <w:rPr>
+      <w:rFonts w:asciiTheme="majorHAnsi" w:eastAsiaTheme="majorEastAsia" w:hAnsiTheme="majorHAnsi" w:cstheme="majorBidi"/>
+      <w:color w:val="2E74B5" w:themeColor="accent1" w:themeShade="BF"/>
+      <w:sz w:val="26"/>
+      <w:szCs w:val="26"/>
+    </w:rPr>
+  </w:style>
   <w:style w:type="character" w:default="1" w:styleId="DefaultParagraphFont">
     <w:name w:val="Default Paragraph Font"/>
     <w:uiPriority w:val="1"/>
@@ -463,6 +898,44 @@
     <w:uiPriority w:val="99"/>
     <w:semiHidden/>
     <w:unhideWhenUsed/>
+  </w:style>
+  <w:style w:type="character" w:customStyle="1" w:styleId="Heading1Char">
+    <w:name w:val="Heading 1 Char"/>
+    <w:basedOn w:val="DefaultParagraphFont"/>
+    <w:link w:val="Heading1"/>
+    <w:uiPriority w:val="9"/>
+    <w:rsid w:val="00201B5D"/>
+    <w:rPr>
+      <w:rFonts w:asciiTheme="majorHAnsi" w:eastAsiaTheme="majorEastAsia" w:hAnsiTheme="majorHAnsi" w:cstheme="majorBidi"/>
+      <w:color w:val="2E74B5" w:themeColor="accent1" w:themeShade="BF"/>
+      <w:sz w:val="32"/>
+      <w:szCs w:val="32"/>
+    </w:rPr>
+  </w:style>
+  <w:style w:type="character" w:customStyle="1" w:styleId="Heading2Char">
+    <w:name w:val="Heading 2 Char"/>
+    <w:basedOn w:val="DefaultParagraphFont"/>
+    <w:link w:val="Heading2"/>
+    <w:uiPriority w:val="9"/>
+    <w:rsid w:val="00201B5D"/>
+    <w:rPr>
+      <w:rFonts w:asciiTheme="majorHAnsi" w:eastAsiaTheme="majorEastAsia" w:hAnsiTheme="majorHAnsi" w:cstheme="majorBidi"/>
+      <w:color w:val="2E74B5" w:themeColor="accent1" w:themeShade="BF"/>
+      <w:sz w:val="26"/>
+      <w:szCs w:val="26"/>
+    </w:rPr>
+  </w:style>
+  <w:style w:type="character" w:styleId="Hyperlink">
+    <w:name w:val="Hyperlink"/>
+    <w:basedOn w:val="DefaultParagraphFont"/>
+    <w:uiPriority w:val="99"/>
+    <w:semiHidden/>
+    <w:unhideWhenUsed/>
+    <w:rsid w:val="006E5402"/>
+    <w:rPr>
+      <w:color w:val="0000FF"/>
+      <w:u w:val="single"/>
+    </w:rPr>
   </w:style>
 </w:styles>
 </file>
@@ -726,4 +1199,16 @@
     </a:ext>
   </a:extLst>
 </a:theme>
+</file>
+
+<file path=customXml/item1.xml><?xml version="1.0" encoding="utf-8"?>
+<b:Sources xmlns:b="http://schemas.openxmlformats.org/officeDocument/2006/bibliography" xmlns="http://schemas.openxmlformats.org/officeDocument/2006/bibliography" SelectedStyle="\APASixthEditionOfficeOnline.xsl" StyleName="APA" Version="6"/>
+</file>
+
+<file path=customXml/itemProps1.xml><?xml version="1.0" encoding="utf-8"?>
+<ds:datastoreItem xmlns:ds="http://schemas.openxmlformats.org/officeDocument/2006/customXml" ds:itemID="{399FBF2A-B9E1-41EB-94A0-BB9936EDE791}">
+  <ds:schemaRefs>
+    <ds:schemaRef ds:uri="http://schemas.openxmlformats.org/officeDocument/2006/bibliography"/>
+  </ds:schemaRefs>
+</ds:datastoreItem>
 </file>
</xml_diff>